<commit_message>
Template: product photo slot in the specification cell
</commit_message>
<xml_diff>
--- a/Ponuda_TEMPLATE.docx
+++ b/Ponuda_TEMPLATE.docx
@@ -358,6 +358,51 @@
               <w:t xml:space="preserve">{specs}</w:t>
             </w:r>
           </w:p>
+          <w:p>
+            <w:pPr>
+              <w:spacing w:before="40"/>
+            </w:pPr>
+            <w:r>
+              <w:rPr>
+                <w:rFonts w:ascii="Arial" w:cs="Arial" w:eastAsia="Arial" w:hAnsi="Arial"/>
+                <w:b w:val="false"/>
+                <w:bCs w:val="false"/>
+                <w:sz w:val="18"/>
+                <w:szCs w:val="18"/>
+              </w:rPr>
+              <w:t xml:space="preserve">{#has_img}</w:t>
+            </w:r>
+          </w:p>
+          <w:p>
+            <w:pPr>
+              <w:spacing w:before="40"/>
+            </w:pPr>
+            <w:r>
+              <w:rPr>
+                <w:rFonts w:ascii="Arial" w:cs="Arial" w:eastAsia="Arial" w:hAnsi="Arial"/>
+                <w:b w:val="false"/>
+                <w:bCs w:val="false"/>
+                <w:sz w:val="18"/>
+                <w:szCs w:val="18"/>
+              </w:rPr>
+              <w:t xml:space="preserve">{%img}</w:t>
+            </w:r>
+          </w:p>
+          <w:p>
+            <w:pPr>
+              <w:spacing w:before="40"/>
+            </w:pPr>
+            <w:r>
+              <w:rPr>
+                <w:rFonts w:ascii="Arial" w:cs="Arial" w:eastAsia="Arial" w:hAnsi="Arial"/>
+                <w:b w:val="false"/>
+                <w:bCs w:val="false"/>
+                <w:sz w:val="18"/>
+                <w:szCs w:val="18"/>
+              </w:rPr>
+              <w:t xml:space="preserve">{/has_img}</w:t>
+            </w:r>
+          </w:p>
         </w:tc>
         <w:tc>
           <w:tcPr>

</xml_diff>

<commit_message>
Offer table: dedicated Слика (photo) column before Спецификација
</commit_message>
<xml_diff>
--- a/Ponuda_TEMPLATE.docx
+++ b/Ponuda_TEMPLATE.docx
@@ -90,7 +90,8 @@
       </w:tblPr>
       <w:tblGrid>
         <w:gridCol w:w="600"/>
-        <w:gridCol w:w="4800"/>
+        <w:gridCol w:w="1700"/>
+        <w:gridCol w:w="3100"/>
         <w:gridCol w:w="900"/>
         <w:gridCol w:w="1000"/>
         <w:gridCol w:w="2060"/>
@@ -136,7 +137,42 @@
         </w:tc>
         <w:tc>
           <w:tcPr>
-            <w:tcW w:type="dxa" w:w="4800"/>
+            <w:tcW w:type="dxa" w:w="1700"/>
+            <w:tcBorders>
+              <w:top w:val="single" w:color="AAAAAA" w:sz="1"/>
+              <w:left w:val="single" w:color="AAAAAA" w:sz="1"/>
+              <w:bottom w:val="single" w:color="AAAAAA" w:sz="1"/>
+              <w:right w:val="single" w:color="AAAAAA" w:sz="1"/>
+            </w:tcBorders>
+            <w:shd w:fill="1F3864" w:val="clear"/>
+            <w:tcMar>
+              <w:top w:type="dxa" w:w="80"/>
+              <w:left w:type="dxa" w:w="120"/>
+              <w:bottom w:type="dxa" w:w="80"/>
+              <w:right w:type="dxa" w:w="120"/>
+            </w:tcMar>
+            <w:vAlign w:val="center"/>
+          </w:tcPr>
+          <w:p>
+            <w:pPr>
+              <w:jc w:val="center"/>
+            </w:pPr>
+            <w:r>
+              <w:rPr>
+                <w:rFonts w:ascii="Arial" w:cs="Arial" w:eastAsia="Arial" w:hAnsi="Arial"/>
+                <w:b/>
+                <w:bCs/>
+                <w:color w:val="FFFFFF"/>
+                <w:sz w:val="20"/>
+                <w:szCs w:val="20"/>
+              </w:rPr>
+              <w:t xml:space="preserve">Слика</w:t>
+            </w:r>
+          </w:p>
+        </w:tc>
+        <w:tc>
+          <w:tcPr>
+            <w:tcW w:type="dxa" w:w="3100"/>
             <w:tcBorders>
               <w:top w:val="single" w:color="AAAAAA" w:sz="1"/>
               <w:left w:val="single" w:color="AAAAAA" w:sz="1"/>
@@ -312,7 +348,71 @@
         </w:tc>
         <w:tc>
           <w:tcPr>
-            <w:tcW w:type="dxa" w:w="4800"/>
+            <w:tcW w:type="dxa" w:w="1700"/>
+            <w:tcBorders>
+              <w:top w:val="single" w:color="AAAAAA" w:sz="1"/>
+              <w:left w:val="single" w:color="AAAAAA" w:sz="1"/>
+              <w:bottom w:val="single" w:color="AAAAAA" w:sz="1"/>
+              <w:right w:val="single" w:color="AAAAAA" w:sz="1"/>
+            </w:tcBorders>
+            <w:shd w:fill="FFFFFF" w:val="clear"/>
+            <w:tcMar>
+              <w:top w:type="dxa" w:w="80"/>
+              <w:left w:type="dxa" w:w="120"/>
+              <w:bottom w:type="dxa" w:w="80"/>
+              <w:right w:type="dxa" w:w="120"/>
+            </w:tcMar>
+            <w:vAlign w:val="center"/>
+          </w:tcPr>
+          <w:p>
+            <w:pPr>
+              <w:jc w:val="center"/>
+            </w:pPr>
+            <w:r>
+              <w:rPr>
+                <w:rFonts w:ascii="Arial" w:cs="Arial" w:eastAsia="Arial" w:hAnsi="Arial"/>
+                <w:b/>
+                <w:bCs/>
+                <w:sz w:val="20"/>
+                <w:szCs w:val="20"/>
+              </w:rPr>
+              <w:t xml:space="preserve">{#has_img}</w:t>
+            </w:r>
+          </w:p>
+          <w:p>
+            <w:pPr>
+              <w:jc w:val="center"/>
+            </w:pPr>
+            <w:r>
+              <w:rPr>
+                <w:rFonts w:ascii="Arial" w:cs="Arial" w:eastAsia="Arial" w:hAnsi="Arial"/>
+                <w:b/>
+                <w:bCs/>
+                <w:sz w:val="20"/>
+                <w:szCs w:val="20"/>
+              </w:rPr>
+              <w:t xml:space="preserve">{%img}</w:t>
+            </w:r>
+          </w:p>
+          <w:p>
+            <w:pPr>
+              <w:jc w:val="center"/>
+            </w:pPr>
+            <w:r>
+              <w:rPr>
+                <w:rFonts w:ascii="Arial" w:cs="Arial" w:eastAsia="Arial" w:hAnsi="Arial"/>
+                <w:b/>
+                <w:bCs/>
+                <w:sz w:val="20"/>
+                <w:szCs w:val="20"/>
+              </w:rPr>
+              <w:t xml:space="preserve">{/has_img}</w:t>
+            </w:r>
+          </w:p>
+        </w:tc>
+        <w:tc>
+          <w:tcPr>
+            <w:tcW w:type="dxa" w:w="3100"/>
             <w:tcBorders>
               <w:top w:val="single" w:color="AAAAAA" w:sz="1"/>
               <w:left w:val="single" w:color="AAAAAA" w:sz="1"/>
@@ -358,51 +458,6 @@
               <w:t xml:space="preserve">{specs}</w:t>
             </w:r>
           </w:p>
-          <w:p>
-            <w:pPr>
-              <w:spacing w:before="40"/>
-            </w:pPr>
-            <w:r>
-              <w:rPr>
-                <w:rFonts w:ascii="Arial" w:cs="Arial" w:eastAsia="Arial" w:hAnsi="Arial"/>
-                <w:b w:val="false"/>
-                <w:bCs w:val="false"/>
-                <w:sz w:val="18"/>
-                <w:szCs w:val="18"/>
-              </w:rPr>
-              <w:t xml:space="preserve">{#has_img}</w:t>
-            </w:r>
-          </w:p>
-          <w:p>
-            <w:pPr>
-              <w:spacing w:before="40"/>
-            </w:pPr>
-            <w:r>
-              <w:rPr>
-                <w:rFonts w:ascii="Arial" w:cs="Arial" w:eastAsia="Arial" w:hAnsi="Arial"/>
-                <w:b w:val="false"/>
-                <w:bCs w:val="false"/>
-                <w:sz w:val="18"/>
-                <w:szCs w:val="18"/>
-              </w:rPr>
-              <w:t xml:space="preserve">{%img}</w:t>
-            </w:r>
-          </w:p>
-          <w:p>
-            <w:pPr>
-              <w:spacing w:before="40"/>
-            </w:pPr>
-            <w:r>
-              <w:rPr>
-                <w:rFonts w:ascii="Arial" w:cs="Arial" w:eastAsia="Arial" w:hAnsi="Arial"/>
-                <w:b w:val="false"/>
-                <w:bCs w:val="false"/>
-                <w:sz w:val="18"/>
-                <w:szCs w:val="18"/>
-              </w:rPr>
-              <w:t xml:space="preserve">{/has_img}</w:t>
-            </w:r>
-          </w:p>
         </w:tc>
         <w:tc>
           <w:tcPr>
@@ -507,7 +562,7 @@
         <w:tc>
           <w:tcPr>
             <w:tcW w:type="dxa" w:w="7300"/>
-            <w:gridSpan w:val="4"/>
+            <w:gridSpan w:val="5"/>
             <w:tcBorders>
               <w:top w:val="single" w:color="AAAAAA" w:sz="1"/>
               <w:left w:val="single" w:color="AAAAAA" w:sz="1"/>

</xml_diff>

<commit_message>
Rebuild branded template with native Word layout (fixes Word rendering + row heights)
</commit_message>
<xml_diff>
--- a/Ponuda_TEMPLATE.docx
+++ b/Ponuda_TEMPLATE.docx
@@ -2,38 +2,136 @@
 <file path=word/document.xml><?xml version="1.0" encoding="utf-8"?>
 <w:document xmlns:mc="http://schemas.openxmlformats.org/markup-compatibility/2006" xmlns:ve="http://schemas.openxmlformats.org/markup-compatibility/2006" xmlns:o="urn:schemas-microsoft-com:office:office" xmlns:r="http://schemas.openxmlformats.org/officeDocument/2006/relationships" xmlns:m="http://schemas.openxmlformats.org/officeDocument/2006/math" xmlns:v="urn:schemas-microsoft-com:vml" xmlns:wp="http://schemas.openxmlformats.org/drawingml/2006/wordprocessingDrawing" xmlns:w10="urn:schemas-microsoft-com:office:word" xmlns:w="http://schemas.openxmlformats.org/wordprocessingml/2006/main" xmlns:wne="http://schemas.microsoft.com/office/word/2006/wordml" xmlns:a="http://schemas.openxmlformats.org/drawingml/2006/main" xmlns:pic="http://schemas.openxmlformats.org/drawingml/2006/picture" xmlns:wpg="http://schemas.microsoft.com/office/word/2010/wordprocessingGroup" xmlns:wps="http://schemas.microsoft.com/office/word/2010/wordprocessingShape" xmlns:w14="http://schemas.microsoft.com/office/word/2010/wordml" mc:Ignorable="w14" xml:space="preserve">
   <w:body>
+    <w:tbl>
+      <w:tblPr>
+        <w:tblW w:type="dxa" w:w="11910"/>
+        <w:tblBorders>
+          <w:top w:val="none" w:sz="0"/>
+          <w:left w:val="none" w:sz="0"/>
+          <w:bottom w:val="none" w:sz="0"/>
+          <w:right w:val="none" w:sz="0"/>
+          <w:insideH w:val="none" w:sz="0"/>
+          <w:insideV w:val="none" w:sz="0"/>
+        </w:tblBorders>
+        <w:tblLayout w:type="fixed"/>
+        <w:tblCellMar>
+          <w:top w:w="0" w:type="dxa"/>
+          <w:left w:w="0" w:type="dxa"/>
+          <w:bottom w:w="0" w:type="dxa"/>
+          <w:right w:w="0" w:type="dxa"/>
+        </w:tblCellMar>
+      </w:tblPr>
+      <w:tblGrid>
+        <w:gridCol w:w="9070"/>
+        <w:gridCol w:w="2840"/>
+      </w:tblGrid>
+      <w:tr>
+        <w:tc>
+          <w:tcPr>
+            <w:tcW w:type="dxa" w:w="9070"/>
+            <w:vAlign w:val="center"/>
+          </w:tcPr>
+          <w:p>
+            <w:pPr>
+              <w:spacing w:before="0" w:after="0"/>
+              <w:ind w:left="993"/>
+            </w:pPr>
+            <w:r>
+              <w:rPr>
+                <w:rFonts w:ascii="Arial" w:hAnsi="Arial" w:cs="Arial"/>
+                <w:b/>
+                <w:sz w:val="26"/>
+                <w:szCs w:val="26"/>
+                <w:color w:val="232323"/>
+              </w:rPr>
+              <w:t xml:space="preserve">Понуда бр.  </w:t>
+            </w:r>
+            <w:r>
+              <w:rPr>
+                <w:rFonts w:ascii="Arial" w:hAnsi="Arial" w:cs="Arial"/>
+                <w:b/>
+                <w:u w:val="single"/>
+                <w:sz w:val="26"/>
+                <w:szCs w:val="26"/>
+                <w:color w:val="1F3864"/>
+              </w:rPr>
+              <w:t xml:space="preserve">{offer_number}</w:t>
+            </w:r>
+          </w:p>
+        </w:tc>
+        <w:tc>
+          <w:tcPr>
+            <w:tcW w:type="dxa" w:w="2840"/>
+            <w:vAlign w:val="top"/>
+          </w:tcPr>
+          <w:p>
+            <w:pPr>
+              <w:spacing w:before="0" w:after="0"/>
+              <w:jc w:val="center"/>
+            </w:pPr>
+            <w:r>
+              <w:drawing>
+                <wp:inline distT="0" distB="0" distL="0" distR="0">
+                  <wp:extent cx="1417320" cy="1408176"/>
+                  <wp:effectExtent l="0" t="0" r="0" b="0"/>
+                  <wp:docPr id="972" name="ELAKS"/>
+                  <wp:cNvGraphicFramePr>
+                    <a:graphicFrameLocks xmlns:a="http://schemas.openxmlformats.org/drawingml/2006/main" noChangeAspect="1"/>
+                  </wp:cNvGraphicFramePr>
+                  <a:graphic xmlns:a="http://schemas.openxmlformats.org/drawingml/2006/main">
+                    <a:graphicData uri="http://schemas.openxmlformats.org/drawingml/2006/picture">
+                      <pic:pic xmlns:pic="http://schemas.openxmlformats.org/drawingml/2006/picture">
+                        <pic:nvPicPr>
+                          <pic:cNvPr id="0" name="ELAKS"/>
+                          <pic:cNvPicPr/>
+                        </pic:nvPicPr>
+                        <pic:blipFill>
+                          <a:blip r:embed="rIdLOGO"/>
+                          <a:stretch>
+                            <a:fillRect/>
+                          </a:stretch>
+                        </pic:blipFill>
+                        <pic:spPr>
+                          <a:xfrm>
+                            <a:off x="0" y="0"/>
+                            <a:ext cx="1417320" cy="1408176"/>
+                          </a:xfrm>
+                          <a:prstGeom prst="rect">
+                            <a:avLst/>
+                          </a:prstGeom>
+                        </pic:spPr>
+                      </pic:pic>
+                    </a:graphicData>
+                  </a:graphic>
+                </wp:inline>
+              </w:drawing>
+            </w:r>
+          </w:p>
+        </w:tc>
+      </w:tr>
+    </w:tbl>
     <w:p>
       <w:pPr>
-        <w:pStyle w:val="BodyText"/>
-        <w:rPr>
-          <w:rFonts w:ascii="Times New Roman"/>
-          <w:b w:val="0"/>
-          <w:sz w:val="20"/>
-        </w:rPr>
+        <w:spacing w:before="380" w:after="0"/>
       </w:pPr>
       <w:r>
-        <w:rPr>
-          <w:rFonts w:ascii="Times New Roman"/>
-          <w:b w:val="0"/>
-          <w:sz w:val="20"/>
-        </w:rPr>
         <w:drawing>
           <wp:inline distT="0" distB="0" distL="0" distR="0">
-            <wp:extent cx="7173941" cy="3895344"/>
+            <wp:extent cx="4498848" cy="576072"/>
             <wp:effectExtent l="0" t="0" r="0" b="0"/>
-            <wp:docPr id="1" name="Image 1" descr="A picture containing logo  Description automatically generated"/>
+            <wp:docPr id="981" name="Klient"/>
             <wp:cNvGraphicFramePr>
-              <a:graphicFrameLocks/>
+              <a:graphicFrameLocks xmlns:a="http://schemas.openxmlformats.org/drawingml/2006/main" noChangeAspect="1"/>
             </wp:cNvGraphicFramePr>
-            <a:graphic>
+            <a:graphic xmlns:a="http://schemas.openxmlformats.org/drawingml/2006/main">
               <a:graphicData uri="http://schemas.openxmlformats.org/drawingml/2006/picture">
-                <pic:pic>
+                <pic:pic xmlns:pic="http://schemas.openxmlformats.org/drawingml/2006/picture">
                   <pic:nvPicPr>
-                    <pic:cNvPr id="1" name="Image 1" descr="A picture containing logo  Description automatically generated"/>
+                    <pic:cNvPr id="0" name="Klient"/>
                     <pic:cNvPicPr/>
                   </pic:nvPicPr>
                   <pic:blipFill>
-                    <a:blip r:embed="rId5" cstate="print"/>
+                    <a:blip r:embed="rIdBANNER"/>
                     <a:stretch>
                       <a:fillRect/>
                     </a:stretch>
@@ -41,7 +139,7 @@
                   <pic:spPr>
                     <a:xfrm>
                       <a:off x="0" y="0"/>
-                      <a:ext cx="7173941" cy="3895344"/>
+                      <a:ext cx="4498848" cy="576072"/>
                     </a:xfrm>
                     <a:prstGeom prst="rect">
                       <a:avLst/>
@@ -53,267 +151,274 @@
           </wp:inline>
         </w:drawing>
       </w:r>
-      <w:r>
-        <w:pict>
-          <v:rect style="position:absolute;margin-left:140.4pt;margin-top:44.6pt;width:108.0pt;height:18.7pt;z-index:12;mso-position-horizontal-relative:page;mso-position-vertical-relative:page" filled="f" stroked="f">
-            <v:textbox inset="0,0,0,0">
-              <w:txbxContent>
-                <w:p>
-                  <w:pPr>
-                    <w:spacing w:before="0" w:after="0" w:line="240" w:lineRule="auto"/>
-                    <w:rPr>
-                      <w:rFonts w:ascii="Arial" w:hAnsi="Arial" w:cs="Arial"/>
-                      <w:b/>
-                      <w:sz w:val="26"/>
-                      <w:color w:val="1F3864"/>
-                    </w:rPr>
-                  </w:pPr>
-                  <w:r>
-                    <w:rPr>
-                      <w:rFonts w:ascii="Arial" w:hAnsi="Arial" w:cs="Arial"/>
-                      <w:b/>
-                      <w:sz w:val="26"/>
-                      <w:color w:val="1F3864"/>
-                    </w:rPr>
-                    <w:t xml:space="preserve">{offer_number}</w:t>
-                  </w:r>
-                </w:p>
-              </w:txbxContent>
-            </v:textbox>
-          </v:rect>
-        </w:pict>
-      </w:r>
-      <w:r>
-        <w:pict>
-          <v:rect style="position:absolute;margin-left:144.0pt;margin-top:183.6pt;width:176.4pt;height:21.6pt;z-index:12;mso-position-horizontal-relative:page;mso-position-vertical-relative:page" filled="f" stroked="f">
-            <v:textbox inset="0,0,0,0">
-              <w:txbxContent>
-                <w:p>
-                  <w:pPr>
-                    <w:spacing w:before="0" w:after="0" w:line="240" w:lineRule="auto"/>
-                    <w:rPr>
-                      <w:rFonts w:ascii="Arial" w:hAnsi="Arial" w:cs="Arial"/>
-                      <w:b/>
-                      <w:sz w:val="24"/>
-                      <w:color w:val="FFFFFF"/>
-                    </w:rPr>
-                  </w:pPr>
-                  <w:r>
-                    <w:rPr>
-                      <w:rFonts w:ascii="Arial" w:hAnsi="Arial" w:cs="Arial"/>
-                      <w:b/>
-                      <w:sz w:val="24"/>
-                      <w:color w:val="FFFFFF"/>
-                    </w:rPr>
-                    <w:t xml:space="preserve">{client}</w:t>
-                  </w:r>
-                </w:p>
-              </w:txbxContent>
-            </v:textbox>
-          </v:rect>
-        </w:pict>
-      </w:r>
-      <w:r>
-        <w:pict>
-          <v:rect style="position:absolute;margin-left:133.2pt;margin-top:217.4pt;width:331.2pt;height:15.8pt;z-index:12;mso-position-horizontal-relative:page;mso-position-vertical-relative:page" filled="f" stroked="f">
-            <v:textbox inset="0,0,0,0">
-              <w:txbxContent>
-                <w:p>
-                  <w:pPr>
-                    <w:spacing w:before="0" w:after="0" w:line="240" w:lineRule="auto"/>
-                    <w:rPr>
-                      <w:rFonts w:ascii="Arial" w:hAnsi="Arial" w:cs="Arial"/>
-                      <w:sz w:val="20"/>
-                      <w:color w:val="404040"/>
-                    </w:rPr>
-                  </w:pPr>
-                  <w:r>
-                    <w:rPr>
-                      <w:rFonts w:ascii="Arial" w:hAnsi="Arial" w:cs="Arial"/>
-                      <w:sz w:val="20"/>
-                      <w:color w:val="404040"/>
-                    </w:rPr>
-                    <w:t xml:space="preserve">{client_contact}</w:t>
-                  </w:r>
-                </w:p>
-              </w:txbxContent>
-            </v:textbox>
-          </v:rect>
-        </w:pict>
-      </w:r>
-      <w:r>
-        <w:pict>
-          <v:rect style="position:absolute;margin-left:133.2pt;margin-top:237.6pt;width:331.2pt;height:15.8pt;z-index:12;mso-position-horizontal-relative:page;mso-position-vertical-relative:page" filled="f" stroked="f">
-            <v:textbox inset="0,0,0,0">
-              <w:txbxContent>
-                <w:p>
-                  <w:pPr>
-                    <w:spacing w:before="0" w:after="0" w:line="240" w:lineRule="auto"/>
-                    <w:rPr>
-                      <w:rFonts w:ascii="Arial" w:hAnsi="Arial" w:cs="Arial"/>
-                      <w:sz w:val="20"/>
-                      <w:color w:val="404040"/>
-                    </w:rPr>
-                  </w:pPr>
-                  <w:r>
-                    <w:rPr>
-                      <w:rFonts w:ascii="Arial" w:hAnsi="Arial" w:cs="Arial"/>
-                      <w:sz w:val="20"/>
-                      <w:color w:val="404040"/>
-                    </w:rPr>
-                    <w:t xml:space="preserve">{client_phone}</w:t>
-                  </w:r>
-                </w:p>
-              </w:txbxContent>
-            </v:textbox>
-          </v:rect>
-        </w:pict>
-      </w:r>
-      <w:r>
-        <w:pict>
-          <v:rect style="position:absolute;margin-left:133.2pt;margin-top:257.0pt;width:331.2pt;height:15.8pt;z-index:12;mso-position-horizontal-relative:page;mso-position-vertical-relative:page" filled="f" stroked="f">
-            <v:textbox inset="0,0,0,0">
-              <w:txbxContent>
-                <w:p>
-                  <w:pPr>
-                    <w:spacing w:before="0" w:after="0" w:line="240" w:lineRule="auto"/>
-                    <w:rPr>
-                      <w:rFonts w:ascii="Arial" w:hAnsi="Arial" w:cs="Arial"/>
-                      <w:sz w:val="20"/>
-                      <w:color w:val="404040"/>
-                    </w:rPr>
-                  </w:pPr>
-                  <w:r>
-                    <w:rPr>
-                      <w:rFonts w:ascii="Arial" w:hAnsi="Arial" w:cs="Arial"/>
-                      <w:sz w:val="20"/>
-                      <w:color w:val="404040"/>
-                    </w:rPr>
-                    <w:t xml:space="preserve">{client_address}</w:t>
-                  </w:r>
-                </w:p>
-              </w:txbxContent>
-            </v:textbox>
-          </v:rect>
-        </w:pict>
-      </w:r>
-      <w:r>
-        <w:pict>
-          <v:rect style="position:absolute;margin-left:133.2pt;margin-top:277.2pt;width:331.2pt;height:15.8pt;z-index:12;mso-position-horizontal-relative:page;mso-position-vertical-relative:page" filled="f" stroked="f">
-            <v:textbox inset="0,0,0,0">
-              <w:txbxContent>
-                <w:p>
-                  <w:pPr>
-                    <w:spacing w:before="0" w:after="0" w:line="240" w:lineRule="auto"/>
-                    <w:rPr>
-                      <w:rFonts w:ascii="Arial" w:hAnsi="Arial" w:cs="Arial"/>
-                      <w:sz w:val="20"/>
-                      <w:color w:val="404040"/>
-                    </w:rPr>
-                  </w:pPr>
-                  <w:r>
-                    <w:rPr>
-                      <w:rFonts w:ascii="Arial" w:hAnsi="Arial" w:cs="Arial"/>
-                      <w:sz w:val="20"/>
-                      <w:color w:val="404040"/>
-                    </w:rPr>
-                    <w:t xml:space="preserve">{client_email}</w:t>
-                  </w:r>
-                </w:p>
-              </w:txbxContent>
-            </v:textbox>
-          </v:rect>
-        </w:pict>
-      </w:r>
-      <w:r>
-        <w:pict>
-          <v:rect style="position:absolute;margin-left:133.2pt;margin-top:295.2pt;width:331.2pt;height:15.8pt;z-index:12;mso-position-horizontal-relative:page;mso-position-vertical-relative:page" filled="f" stroked="f">
-            <v:textbox inset="0,0,0,0">
-              <w:txbxContent>
-                <w:p>
-                  <w:pPr>
-                    <w:spacing w:before="0" w:after="0" w:line="240" w:lineRule="auto"/>
-                    <w:rPr>
-                      <w:rFonts w:ascii="Arial" w:hAnsi="Arial" w:cs="Arial"/>
-                      <w:sz w:val="20"/>
-                      <w:color w:val="404040"/>
-                    </w:rPr>
-                  </w:pPr>
-                  <w:r>
-                    <w:rPr>
-                      <w:rFonts w:ascii="Arial" w:hAnsi="Arial" w:cs="Arial"/>
-                      <w:sz w:val="20"/>
-                      <w:color w:val="404040"/>
-                    </w:rPr>
-                    <w:t xml:space="preserve">{date}</w:t>
-                  </w:r>
-                </w:p>
-              </w:txbxContent>
-            </v:textbox>
-          </v:rect>
-        </w:pict>
-      </w:r>
     </w:p>
     <w:p>
       <w:pPr>
-        <w:pStyle w:val="BodyText"/>
+        <w:spacing w:before="120" w:after="220"/>
+        <w:ind w:left="993"/>
+      </w:pPr>
+      <w:r>
         <w:rPr>
-          <w:rFonts w:ascii="Times New Roman"/>
-          <w:b w:val="0"/>
-          <w:sz w:val="20"/>
+          <w:rFonts w:ascii="Arial" w:hAnsi="Arial" w:cs="Arial"/>
+          <w:b/>
+          <w:sz w:val="24"/>
+          <w:szCs w:val="24"/>
+          <w:color w:val="1F3864"/>
         </w:rPr>
-      </w:pPr>
+        <w:t xml:space="preserve">{client}</w:t>
+      </w:r>
     </w:p>
+    <w:tbl>
+      <w:tblPr>
+        <w:tblW w:type="dxa" w:w="11737"/>
+        <w:tblBorders>
+          <w:top w:val="none" w:sz="0"/>
+          <w:left w:val="none" w:sz="0"/>
+          <w:bottom w:val="none" w:sz="0"/>
+          <w:right w:val="none" w:sz="0"/>
+          <w:insideH w:val="none" w:sz="0"/>
+          <w:insideV w:val="none" w:sz="0"/>
+        </w:tblBorders>
+        <w:tblLayout w:type="fixed"/>
+        <w:tblCellMar>
+          <w:top w:w="0" w:type="dxa"/>
+          <w:left w:w="0" w:type="dxa"/>
+          <w:bottom w:w="0" w:type="dxa"/>
+          <w:right w:w="0" w:type="dxa"/>
+        </w:tblCellMar>
+      </w:tblPr>
+      <w:tblGrid>
+        <w:gridCol w:w="2660"/>
+        <w:gridCol w:w="9077"/>
+      </w:tblGrid>
+      <w:tr>
+        <w:tc>
+          <w:tcPr>
+            <w:tcW w:type="dxa" w:w="2660"/>
+            <w:vAlign w:val="center"/>
+          </w:tcPr>
+          <w:p>
+            <w:pPr>
+              <w:spacing w:before="0" w:after="0" w:line="390" w:lineRule="exact"/>
+              <w:ind w:left="993"/>
+            </w:pPr>
+            <w:r>
+              <w:rPr>
+                <w:rFonts w:ascii="Arial" w:hAnsi="Arial" w:cs="Arial"/>
+                <w:sz w:val="19"/>
+                <w:szCs w:val="19"/>
+                <w:color w:val="232323"/>
+              </w:rPr>
+              <w:t xml:space="preserve">Контакт лице:</w:t>
+            </w:r>
+          </w:p>
+        </w:tc>
+        <w:tc>
+          <w:tcPr>
+            <w:tcW w:type="dxa" w:w="9077"/>
+            <w:vAlign w:val="center"/>
+          </w:tcPr>
+          <w:p>
+            <w:pPr>
+              <w:spacing w:before="0" w:after="0" w:line="390" w:lineRule="exact"/>
+            </w:pPr>
+            <w:r>
+              <w:rPr>
+                <w:rFonts w:ascii="Arial" w:hAnsi="Arial" w:cs="Arial"/>
+                <w:sz w:val="19"/>
+                <w:szCs w:val="19"/>
+                <w:color w:val="232323"/>
+              </w:rPr>
+              <w:t xml:space="preserve">{client_contact}</w:t>
+            </w:r>
+          </w:p>
+        </w:tc>
+      </w:tr>
+      <w:tr>
+        <w:tc>
+          <w:tcPr>
+            <w:tcW w:type="dxa" w:w="2660"/>
+            <w:vAlign w:val="center"/>
+          </w:tcPr>
+          <w:p>
+            <w:pPr>
+              <w:spacing w:before="0" w:after="0" w:line="390" w:lineRule="exact"/>
+              <w:ind w:left="993"/>
+            </w:pPr>
+            <w:r>
+              <w:rPr>
+                <w:rFonts w:ascii="Arial" w:hAnsi="Arial" w:cs="Arial"/>
+                <w:sz w:val="19"/>
+                <w:szCs w:val="19"/>
+                <w:color w:val="232323"/>
+              </w:rPr>
+              <w:t xml:space="preserve">Контакт тел:</w:t>
+            </w:r>
+          </w:p>
+        </w:tc>
+        <w:tc>
+          <w:tcPr>
+            <w:tcW w:type="dxa" w:w="9077"/>
+            <w:vAlign w:val="center"/>
+          </w:tcPr>
+          <w:p>
+            <w:pPr>
+              <w:spacing w:before="0" w:after="0" w:line="390" w:lineRule="exact"/>
+            </w:pPr>
+            <w:r>
+              <w:rPr>
+                <w:rFonts w:ascii="Arial" w:hAnsi="Arial" w:cs="Arial"/>
+                <w:sz w:val="19"/>
+                <w:szCs w:val="19"/>
+                <w:color w:val="232323"/>
+              </w:rPr>
+              <w:t xml:space="preserve">{client_phone}</w:t>
+            </w:r>
+          </w:p>
+        </w:tc>
+      </w:tr>
+      <w:tr>
+        <w:tc>
+          <w:tcPr>
+            <w:tcW w:type="dxa" w:w="2660"/>
+            <w:vAlign w:val="center"/>
+          </w:tcPr>
+          <w:p>
+            <w:pPr>
+              <w:spacing w:before="0" w:after="0" w:line="390" w:lineRule="exact"/>
+              <w:ind w:left="993"/>
+            </w:pPr>
+            <w:r>
+              <w:rPr>
+                <w:rFonts w:ascii="Arial" w:hAnsi="Arial" w:cs="Arial"/>
+                <w:sz w:val="19"/>
+                <w:szCs w:val="19"/>
+                <w:color w:val="232323"/>
+              </w:rPr>
+              <w:t xml:space="preserve">Адреса:</w:t>
+            </w:r>
+          </w:p>
+        </w:tc>
+        <w:tc>
+          <w:tcPr>
+            <w:tcW w:type="dxa" w:w="9077"/>
+            <w:vAlign w:val="center"/>
+          </w:tcPr>
+          <w:p>
+            <w:pPr>
+              <w:spacing w:before="0" w:after="0" w:line="390" w:lineRule="exact"/>
+            </w:pPr>
+            <w:r>
+              <w:rPr>
+                <w:rFonts w:ascii="Arial" w:hAnsi="Arial" w:cs="Arial"/>
+                <w:sz w:val="19"/>
+                <w:szCs w:val="19"/>
+                <w:color w:val="232323"/>
+              </w:rPr>
+              <w:t xml:space="preserve">{client_address}</w:t>
+            </w:r>
+          </w:p>
+        </w:tc>
+      </w:tr>
+      <w:tr>
+        <w:tc>
+          <w:tcPr>
+            <w:tcW w:type="dxa" w:w="2660"/>
+            <w:vAlign w:val="center"/>
+          </w:tcPr>
+          <w:p>
+            <w:pPr>
+              <w:spacing w:before="0" w:after="0" w:line="390" w:lineRule="exact"/>
+              <w:ind w:left="993"/>
+            </w:pPr>
+            <w:r>
+              <w:rPr>
+                <w:rFonts w:ascii="Arial" w:hAnsi="Arial" w:cs="Arial"/>
+                <w:sz w:val="19"/>
+                <w:szCs w:val="19"/>
+                <w:color w:val="232323"/>
+              </w:rPr>
+              <w:t xml:space="preserve">e-mail:</w:t>
+            </w:r>
+          </w:p>
+        </w:tc>
+        <w:tc>
+          <w:tcPr>
+            <w:tcW w:type="dxa" w:w="9077"/>
+            <w:vAlign w:val="center"/>
+          </w:tcPr>
+          <w:p>
+            <w:pPr>
+              <w:spacing w:before="0" w:after="0" w:line="390" w:lineRule="exact"/>
+            </w:pPr>
+            <w:r>
+              <w:rPr>
+                <w:rFonts w:ascii="Arial" w:hAnsi="Arial" w:cs="Arial"/>
+                <w:sz w:val="19"/>
+                <w:szCs w:val="19"/>
+                <w:color w:val="232323"/>
+              </w:rPr>
+              <w:t xml:space="preserve">{client_email}</w:t>
+            </w:r>
+          </w:p>
+        </w:tc>
+      </w:tr>
+      <w:tr>
+        <w:tc>
+          <w:tcPr>
+            <w:tcW w:type="dxa" w:w="2660"/>
+            <w:vAlign w:val="center"/>
+          </w:tcPr>
+          <w:p>
+            <w:pPr>
+              <w:spacing w:before="0" w:after="0" w:line="390" w:lineRule="exact"/>
+              <w:ind w:left="993"/>
+            </w:pPr>
+            <w:r>
+              <w:rPr>
+                <w:rFonts w:ascii="Arial" w:hAnsi="Arial" w:cs="Arial"/>
+                <w:sz w:val="19"/>
+                <w:szCs w:val="19"/>
+                <w:color w:val="232323"/>
+              </w:rPr>
+              <w:t xml:space="preserve">Датум:</w:t>
+            </w:r>
+          </w:p>
+        </w:tc>
+        <w:tc>
+          <w:tcPr>
+            <w:tcW w:type="dxa" w:w="9077"/>
+            <w:vAlign w:val="center"/>
+          </w:tcPr>
+          <w:p>
+            <w:pPr>
+              <w:spacing w:before="0" w:after="0" w:line="390" w:lineRule="exact"/>
+            </w:pPr>
+            <w:r>
+              <w:rPr>
+                <w:rFonts w:ascii="Arial" w:hAnsi="Arial" w:cs="Arial"/>
+                <w:sz w:val="19"/>
+                <w:szCs w:val="19"/>
+                <w:color w:val="232323"/>
+              </w:rPr>
+              <w:t xml:space="preserve">{date}</w:t>
+            </w:r>
+          </w:p>
+        </w:tc>
+      </w:tr>
+    </w:tbl>
     <w:p>
       <w:pPr>
-        <w:pStyle w:val="BodyText"/>
+        <w:spacing w:before="0" w:after="0"/>
+      </w:pPr>
+      <w:r>
         <w:rPr>
-          <w:rFonts w:ascii="Times New Roman"/>
-          <w:b w:val="0"/>
+          <w:rFonts w:ascii="Arial" w:hAnsi="Arial" w:cs="Arial"/>
           <w:sz w:val="20"/>
+          <w:szCs w:val="20"/>
         </w:rPr>
-      </w:pPr>
-    </w:p>
-    <w:p>
-      <w:pPr>
-        <w:pStyle w:val="BodyText"/>
-        <w:rPr>
-          <w:rFonts w:ascii="Times New Roman"/>
-          <w:b w:val="0"/>
-          <w:sz w:val="20"/>
-        </w:rPr>
-      </w:pPr>
-    </w:p>
-    <w:p>
-      <w:pPr>
-        <w:pStyle w:val="BodyText"/>
-        <w:rPr>
-          <w:rFonts w:ascii="Times New Roman"/>
-          <w:b w:val="0"/>
-          <w:sz w:val="20"/>
-        </w:rPr>
-      </w:pPr>
-    </w:p>
-    <w:p>
-      <w:pPr>
-        <w:pStyle w:val="BodyText"/>
-        <w:rPr>
-          <w:rFonts w:ascii="Times New Roman"/>
-          <w:b w:val="0"/>
-          <w:sz w:val="20"/>
-        </w:rPr>
-      </w:pPr>
-    </w:p>
-    <w:p>
-      <w:pPr>
-        <w:pStyle w:val="BodyText"/>
-        <w:spacing w:before="41"/>
-        <w:rPr>
-          <w:rFonts w:ascii="Times New Roman"/>
-          <w:b w:val="0"/>
-          <w:sz w:val="20"/>
-        </w:rPr>
-      </w:pPr>
+        <w:t xml:space="preserve"/>
+      </w:r>
     </w:p>
     <w:tbl>
       <w:tblPr>
@@ -559,9 +664,6 @@
         </w:tc>
       </w:tr>
       <w:tr>
-        <w:trPr>
-          <w:trHeight w:val="2658" w:hRule="atLeast"/>
-        </w:trPr>
         <w:tc>
           <w:tcPr>
             <w:tcW w:w="398" w:type="dxa"/>
@@ -775,9 +877,6 @@
         </w:tc>
       </w:tr>
       <w:tr>
-        <w:trPr>
-          <w:trHeight w:val="694" w:hRule="atLeast"/>
-        </w:trPr>
         <w:tc>
           <w:tcPr>
             <w:tcW w:w="11737" w:type="dxa"/>

</xml_diff>

<commit_message>
Template: photo marker instead of image-module tag
</commit_message>
<xml_diff>
--- a/Ponuda_TEMPLATE.docx
+++ b/Ponuda_TEMPLATE.docx
@@ -713,41 +713,7 @@
               <w:rPr>
                 <w:sz w:val="20"/>
               </w:rPr>
-              <w:t xml:space="preserve">{#has_img}</w:t>
-            </w:r>
-          </w:p>
-          <w:p>
-            <w:pPr>
-              <w:pStyle w:val="TableParagraph"/>
-              <w:spacing w:before="60" w:after="60"/>
-              <w:ind w:left="120" w:right="120"/>
-              <w:jc w:val="center"/>
-              <w:rPr>
-                <w:sz w:val="20"/>
-              </w:rPr>
-            </w:pPr>
-            <w:r>
-              <w:rPr>
-                <w:sz w:val="20"/>
-              </w:rPr>
-              <w:t xml:space="preserve">{%img}</w:t>
-            </w:r>
-          </w:p>
-          <w:p>
-            <w:pPr>
-              <w:pStyle w:val="TableParagraph"/>
-              <w:spacing w:before="60" w:after="60"/>
-              <w:ind w:left="120" w:right="120"/>
-              <w:jc w:val="center"/>
-              <w:rPr>
-                <w:sz w:val="20"/>
-              </w:rPr>
-            </w:pPr>
-            <w:r>
-              <w:rPr>
-                <w:sz w:val="20"/>
-              </w:rPr>
-              <w:t xml:space="preserve">{/has_img}</w:t>
+              <w:t xml:space="preserve">{img_mark}</w:t>
             </w:r>
           </w:p>
         </w:tc>

</xml_diff>